<commit_message>
feat(contratos): Diretrizes de Uso preenchidas pela proprietária no Anexo IV, rateio por unidade (R$ 100,00) e 3 veículos no CPCV/Estatuto v1.1, e Estatuto, Diretrizes, Anexo II e boleto na aba Contratos (v1.57.0)
Co-Authored-By: Claude Opus 5.5 <noreply@anthropic.com>
</commit_message>
<xml_diff>
--- a/templates/MODELO-ESTATUTO-ASSOCIACAO-BOM-JARDIMS-v1.docx
+++ b/templates/MODELO-ESTATUTO-ASSOCIACAO-BOM-JARDIMS-v1.docx
@@ -308,14 +308,14 @@
           <w:rFonts w:ascii="Times New Roman" w:hAnsi="Times New Roman"/>
           <w:b/>
         </w:rPr>
-        <w:t>proporcionalmente à área de cada chácara</w:t>
+        <w:t>igualmente por unidade</w:t>
       </w:r>
       <w:r>
         <w:rPr>
           <w:rFonts w:ascii="Times New Roman" w:hAnsi="Times New Roman"/>
           <w:b w:val="0"/>
         </w:rPr>
-        <w:t xml:space="preserve"> constante do Acervo Técnico (as chácaras de área padrão pagam valores iguais); II — as contribuições extraordinárias aprovadas em Assembleia; III — a tarifa de água pelo consumo medido em hidrômetro individual; IV — multas, doações, rendimentos e receitas de serviços.</w:t>
+        <w:t xml:space="preserve"> (cada chácara paga o mesmo valor, qualquer que seja a sua área); II — as contribuições extraordinárias aprovadas em Assembleia; III — a tarifa de água pelo consumo medido em hidrômetro individual; IV — multas, doações, rendimentos e receitas de serviços.</w:t>
       </w:r>
     </w:p>
     <w:p>
@@ -885,7 +885,7 @@
           <w:rFonts w:ascii="Times New Roman" w:hAnsi="Times New Roman"/>
           <w:b w:val="0"/>
         </w:rPr>
-        <w:t>, por ele indicados no cadastro (nome, parentesco, documento e foto), emitidas pela administração. A carteira dá acesso às áreas comuns e à área de vivência (Quadra F) e deve ser apresentada na portaria.</w:t>
+        <w:t>, por ele indicados no cadastro (nome, parentesco, documento e foto), emitidas pela administração. A carteira dá acesso às áreas comuns e à área de vivência (Quadra F) e deve ser apresentada na portaria. Cada chácara pode cadastrar na portaria até 3 (três) veículos.</w:t>
       </w:r>
     </w:p>
     <w:p>

</xml_diff>